<commit_message>
Uploaded most recent file for this ECR
</commit_message>
<xml_diff>
--- a/downloads/SOE - ECR-001 - Initial Deployment.docx
+++ b/downloads/SOE - ECR-001 - Initial Deployment.docx
@@ -1,6 +1,6 @@
 
 <file path=word/document.xml><?xml version="1.0" encoding="utf-8"?>
-<w:document xmlns:wpc="http://schemas.microsoft.com/office/word/2010/wordprocessingCanvas" xmlns:mc="http://schemas.openxmlformats.org/markup-compatibility/2006" xmlns:o="urn:schemas-microsoft-com:office:office" xmlns:r="http://schemas.openxmlformats.org/officeDocument/2006/relationships" xmlns:m="http://schemas.openxmlformats.org/officeDocument/2006/math" xmlns:v="urn:schemas-microsoft-com:vml" xmlns:wp14="http://schemas.microsoft.com/office/word/2010/wordprocessingDrawing" xmlns:wp="http://schemas.openxmlformats.org/drawingml/2006/wordprocessingDrawing" xmlns:w10="urn:schemas-microsoft-com:office:word" xmlns:w="http://schemas.openxmlformats.org/wordprocessingml/2006/main" xmlns:w14="http://schemas.microsoft.com/office/word/2010/wordml" xmlns:w15="http://schemas.microsoft.com/office/word/2012/wordml" xmlns:wpg="http://schemas.microsoft.com/office/word/2010/wordprocessingGroup" xmlns:wpi="http://schemas.microsoft.com/office/word/2010/wordprocessingInk" xmlns:wne="http://schemas.microsoft.com/office/word/2006/wordml" xmlns:wps="http://schemas.microsoft.com/office/word/2010/wordprocessingShape" mc:Ignorable="w14 w15 wp14">
+<w:document xmlns:wpc="http://schemas.microsoft.com/office/word/2010/wordprocessingCanvas" xmlns:cx="http://schemas.microsoft.com/office/drawing/2014/chartex" xmlns:cx1="http://schemas.microsoft.com/office/drawing/2015/9/8/chartex" xmlns:cx2="http://schemas.microsoft.com/office/drawing/2015/10/21/chartex" xmlns:cx3="http://schemas.microsoft.com/office/drawing/2016/5/9/chartex" xmlns:cx4="http://schemas.microsoft.com/office/drawing/2016/5/10/chartex" xmlns:cx5="http://schemas.microsoft.com/office/drawing/2016/5/11/chartex" xmlns:cx6="http://schemas.microsoft.com/office/drawing/2016/5/12/chartex" xmlns:cx7="http://schemas.microsoft.com/office/drawing/2016/5/13/chartex" xmlns:cx8="http://schemas.microsoft.com/office/drawing/2016/5/14/chartex" xmlns:mc="http://schemas.openxmlformats.org/markup-compatibility/2006" xmlns:aink="http://schemas.microsoft.com/office/drawing/2016/ink" xmlns:am3d="http://schemas.microsoft.com/office/drawing/2017/model3d" xmlns:o="urn:schemas-microsoft-com:office:office" xmlns:r="http://schemas.openxmlformats.org/officeDocument/2006/relationships" xmlns:m="http://schemas.openxmlformats.org/officeDocument/2006/math" xmlns:v="urn:schemas-microsoft-com:vml" xmlns:wp14="http://schemas.microsoft.com/office/word/2010/wordprocessingDrawing" xmlns:wp="http://schemas.openxmlformats.org/drawingml/2006/wordprocessingDrawing" xmlns:w10="urn:schemas-microsoft-com:office:word" xmlns:w="http://schemas.openxmlformats.org/wordprocessingml/2006/main" xmlns:w14="http://schemas.microsoft.com/office/word/2010/wordml" xmlns:w15="http://schemas.microsoft.com/office/word/2012/wordml" xmlns:w16cex="http://schemas.microsoft.com/office/word/2018/wordml/cex" xmlns:w16cid="http://schemas.microsoft.com/office/word/2016/wordml/cid" xmlns:w16="http://schemas.microsoft.com/office/word/2018/wordml" xmlns:w16sdtdh="http://schemas.microsoft.com/office/word/2020/wordml/sdtdatahash" xmlns:w16se="http://schemas.microsoft.com/office/word/2015/wordml/symex" xmlns:wpg="http://schemas.microsoft.com/office/word/2010/wordprocessingGroup" xmlns:wpi="http://schemas.microsoft.com/office/word/2010/wordprocessingInk" xmlns:wne="http://schemas.microsoft.com/office/word/2006/wordml" xmlns:wps="http://schemas.microsoft.com/office/word/2010/wordprocessingShape" mc:Ignorable="w14 w15 w16se w16cid w16 w16cex w16sdtdh wp14">
   <w:body>
     <w:p>
       <w:pPr>
@@ -295,7 +295,7 @@
         <w:rPr>
           <w:color w:val="4F6228" w:themeColor="accent3" w:themeShade="80"/>
         </w:rPr>
-        <w:pict>
+        <w:pict w14:anchorId="7DBE849B">
           <v:rect id="_x0000_i1025" style="width:468pt;height:2pt" o:hralign="center" o:hrstd="t" o:hrnoshade="t" o:hr="t" fillcolor="#4e6128 [1606]" stroked="f"/>
         </w:pict>
       </w:r>
@@ -329,7 +329,7 @@
         <w:rPr>
           <w:color w:val="4F6228" w:themeColor="accent3" w:themeShade="80"/>
         </w:rPr>
-        <w:pict>
+        <w:pict w14:anchorId="10F23735">
           <v:rect id="_x0000_i1026" style="width:468pt;height:2pt" o:hralign="center" o:hrstd="t" o:hrnoshade="t" o:hr="t" fillcolor="#4e6128 [1606]" stroked="f"/>
         </w:pict>
       </w:r>
@@ -455,7 +455,7 @@
         <w:rPr>
           <w:color w:val="4F6228" w:themeColor="accent3" w:themeShade="80"/>
         </w:rPr>
-        <w:pict>
+        <w:pict w14:anchorId="373C9A56">
           <v:rect id="_x0000_i1027" style="width:468pt;height:2pt" o:hralign="center" o:hrstd="t" o:hrnoshade="t" o:hr="t" fillcolor="#4e6128 [1606]" stroked="f"/>
         </w:pict>
       </w:r>
@@ -533,7 +533,10 @@
       </w:r>
       <w:proofErr w:type="spellStart"/>
       <w:r>
-        <w:t>pkt</w:t>
+        <w:t>pk</w:t>
+      </w:r>
+      <w:r>
+        <w:t>a</w:t>
       </w:r>
       <w:proofErr w:type="spellEnd"/>
       <w:r>
@@ -560,7 +563,7 @@
         <w:rPr>
           <w:color w:val="4F6228" w:themeColor="accent3" w:themeShade="80"/>
         </w:rPr>
-        <w:pict>
+        <w:pict w14:anchorId="2AF9A3EB">
           <v:rect id="_x0000_i1028" style="width:468pt;height:2pt" o:hralign="center" o:hrstd="t" o:hrnoshade="t" o:hr="t" fillcolor="#4e6128 [1606]" stroked="f"/>
         </w:pict>
       </w:r>
@@ -710,7 +713,10 @@
       </w:r>
       <w:proofErr w:type="spellStart"/>
       <w:r>
-        <w:t>pkt</w:t>
+        <w:t>pk</w:t>
+      </w:r>
+      <w:r>
+        <w:t>a</w:t>
       </w:r>
       <w:proofErr w:type="spellEnd"/>
       <w:r>
@@ -748,7 +754,7 @@
         <w:rPr>
           <w:color w:val="4F6228" w:themeColor="accent3" w:themeShade="80"/>
         </w:rPr>
-        <w:pict>
+        <w:pict w14:anchorId="46123D92">
           <v:rect id="_x0000_i1029" style="width:468pt;height:2pt" o:hralign="center" o:hrstd="t" o:hrnoshade="t" o:hr="t" fillcolor="#4e6128 [1606]" stroked="f"/>
         </w:pict>
       </w:r>
@@ -863,7 +869,7 @@
         <w:rPr>
           <w:color w:val="4F6228" w:themeColor="accent3" w:themeShade="80"/>
         </w:rPr>
-        <w:pict>
+        <w:pict w14:anchorId="44D0E3A7">
           <v:rect id="_x0000_i1030" style="width:468pt;height:2pt" o:hralign="center" o:hrstd="t" o:hrnoshade="t" o:hr="t" fillcolor="#4e6128 [1606]" stroked="f"/>
         </w:pict>
       </w:r>
@@ -955,7 +961,10 @@
       </w:r>
       <w:proofErr w:type="spellStart"/>
       <w:r>
-        <w:t>pkt</w:t>
+        <w:t>pk</w:t>
+      </w:r>
+      <w:r>
+        <w:t>a</w:t>
       </w:r>
       <w:proofErr w:type="spellEnd"/>
       <w:r>
@@ -972,7 +981,7 @@
     </w:p>
     <w:p>
       <w:r>
-        <w:pict>
+        <w:pict w14:anchorId="1CBA60CD">
           <v:rect id="_x0000_i1031" style="width:468pt;height:1.5pt" o:hralign="center" o:hrstd="t" o:hrnoshade="t" o:hr="t" fillcolor="#974706 [1609]" stroked="f"/>
         </w:pict>
       </w:r>
@@ -1081,7 +1090,10 @@
       </w:r>
       <w:proofErr w:type="spellStart"/>
       <w:r>
-        <w:t>pkt</w:t>
+        <w:t>pk</w:t>
+      </w:r>
+      <w:r>
+        <w:t>a</w:t>
       </w:r>
       <w:proofErr w:type="spellEnd"/>
       <w:r>
@@ -1090,7 +1102,7 @@
     </w:p>
     <w:p>
       <w:r>
-        <w:pict>
+        <w:pict w14:anchorId="352057DD">
           <v:rect id="_x0000_i1032" style="width:468pt;height:1.5pt" o:hralign="center" o:hrstd="t" o:hrnoshade="t" o:hr="t" fillcolor="#974706 [1609]" stroked="f"/>
         </w:pict>
       </w:r>
@@ -1202,6 +1214,7 @@
             <w14:uncheckedState w14:val="2610" w14:font="MS Gothic"/>
           </w14:checkbox>
         </w:sdtPr>
+        <w:sdtEndPr/>
         <w:sdtContent>
           <w:r>
             <w:rPr>
@@ -1235,6 +1248,7 @@
             <w14:uncheckedState w14:val="2610" w14:font="MS Gothic"/>
           </w14:checkbox>
         </w:sdtPr>
+        <w:sdtEndPr/>
         <w:sdtContent>
           <w:r>
             <w:rPr>
@@ -1268,6 +1282,7 @@
             <w14:uncheckedState w14:val="2610" w14:font="MS Gothic"/>
           </w14:checkbox>
         </w:sdtPr>
+        <w:sdtEndPr/>
         <w:sdtContent>
           <w:r>
             <w:rPr>
@@ -1301,6 +1316,7 @@
             <w14:uncheckedState w14:val="2610" w14:font="MS Gothic"/>
           </w14:checkbox>
         </w:sdtPr>
+        <w:sdtEndPr/>
         <w:sdtContent>
           <w:r>
             <w:rPr>
@@ -1334,6 +1350,7 @@
             <w14:uncheckedState w14:val="2610" w14:font="MS Gothic"/>
           </w14:checkbox>
         </w:sdtPr>
+        <w:sdtEndPr/>
         <w:sdtContent>
           <w:r>
             <w:rPr>
@@ -1369,7 +1386,7 @@
     </w:p>
     <w:p>
       <w:r>
-        <w:pict>
+        <w:pict w14:anchorId="34D78663">
           <v:rect id="_x0000_i1033" style="width:468pt;height:1.5pt" o:hralign="center" o:hrstd="t" o:hrnoshade="t" o:hr="t" fillcolor="#974706 [1609]" stroked="f"/>
         </w:pict>
       </w:r>
@@ -1407,6 +1424,7 @@
             <w14:uncheckedState w14:val="2610" w14:font="MS Gothic"/>
           </w14:checkbox>
         </w:sdtPr>
+        <w:sdtEndPr/>
         <w:sdtContent>
           <w:r>
             <w:rPr>
@@ -1440,6 +1458,7 @@
             <w14:uncheckedState w14:val="2610" w14:font="MS Gothic"/>
           </w14:checkbox>
         </w:sdtPr>
+        <w:sdtEndPr/>
         <w:sdtContent>
           <w:r>
             <w:rPr>
@@ -1473,6 +1492,7 @@
             <w14:uncheckedState w14:val="2610" w14:font="MS Gothic"/>
           </w14:checkbox>
         </w:sdtPr>
+        <w:sdtEndPr/>
         <w:sdtContent>
           <w:r>
             <w:rPr>
@@ -1490,7 +1510,10 @@
       </w:r>
       <w:proofErr w:type="spellStart"/>
       <w:r>
-        <w:t>pkt</w:t>
+        <w:t>pk</w:t>
+      </w:r>
+      <w:r>
+        <w:t>a</w:t>
       </w:r>
       <w:proofErr w:type="spellEnd"/>
       <w:r>
@@ -1514,6 +1537,7 @@
             <w14:uncheckedState w14:val="2610" w14:font="MS Gothic"/>
           </w14:checkbox>
         </w:sdtPr>
+        <w:sdtEndPr/>
         <w:sdtContent>
           <w:r>
             <w:rPr>
@@ -1532,7 +1556,7 @@
     </w:p>
     <w:p>
       <w:r>
-        <w:pict>
+        <w:pict w14:anchorId="4B4B5A48">
           <v:rect id="_x0000_i1034" style="width:468pt;height:1.5pt" o:hralign="center" o:hrstd="t" o:hrnoshade="t" o:hr="t" fillcolor="#974706 [1609]" stroked="f"/>
         </w:pict>
       </w:r>
@@ -1570,6 +1594,7 @@
             <w14:uncheckedState w14:val="2610" w14:font="MS Gothic"/>
           </w14:checkbox>
         </w:sdtPr>
+        <w:sdtEndPr/>
         <w:sdtContent>
           <w:r>
             <w:rPr>
@@ -1587,7 +1612,10 @@
       </w:r>
       <w:proofErr w:type="spellStart"/>
       <w:r>
-        <w:t>pkt</w:t>
+        <w:t>pk</w:t>
+      </w:r>
+      <w:r>
+        <w:t>a</w:t>
       </w:r>
       <w:proofErr w:type="spellEnd"/>
       <w:r>
@@ -1611,6 +1639,7 @@
             <w14:uncheckedState w14:val="2610" w14:font="MS Gothic"/>
           </w14:checkbox>
         </w:sdtPr>
+        <w:sdtEndPr/>
         <w:sdtContent>
           <w:r>
             <w:rPr>
@@ -1635,7 +1664,7 @@
         <w:rPr>
           <w:color w:val="4F6228" w:themeColor="accent3" w:themeShade="80"/>
         </w:rPr>
-        <w:pict>
+        <w:pict w14:anchorId="24D35F97">
           <v:rect id="_x0000_i1035" style="width:468pt;height:2pt" o:hralign="center" o:hrstd="t" o:hrnoshade="t" o:hr="t" fillcolor="#4e6128 [1606]" stroked="f"/>
         </w:pict>
       </w:r>
@@ -1693,7 +1722,7 @@
       </w:pPr>
       <w:r>
         <w:lastRenderedPageBreak/>
-        <w:pict>
+        <w:pict w14:anchorId="5C06D8C1">
           <v:rect id="_x0000_i1036" style="width:468pt;height:1.5pt" o:hralign="center" o:hrstd="t" o:hrnoshade="t" o:hr="t" fillcolor="#974706 [1609]" stroked="f"/>
         </w:pict>
       </w:r>
@@ -1842,7 +1871,7 @@
         <w:spacing w:before="100" w:beforeAutospacing="1" w:after="100" w:afterAutospacing="1"/>
       </w:pPr>
       <w:r>
-        <w:pict>
+        <w:pict w14:anchorId="0DB64719">
           <v:rect id="_x0000_i1037" style="width:468pt;height:1.5pt" o:hralign="center" o:hrstd="t" o:hrnoshade="t" o:hr="t" fillcolor="#974706 [1609]" stroked="f"/>
         </w:pict>
       </w:r>
@@ -1889,7 +1918,7 @@
         <w:pStyle w:val="Heading4"/>
       </w:pPr>
       <w:r>
-        <w:pict>
+        <w:pict w14:anchorId="24D23B89">
           <v:rect id="_x0000_i1038" style="width:468pt;height:1.5pt" o:hralign="center" o:hrstd="t" o:hrnoshade="t" o:hr="t" fillcolor="#974706 [1609]" stroked="f"/>
         </w:pict>
       </w:r>
@@ -1933,7 +1962,7 @@
         <w:spacing w:before="100" w:beforeAutospacing="1" w:after="100" w:afterAutospacing="1"/>
       </w:pPr>
       <w:r>
-        <w:pict>
+        <w:pict w14:anchorId="3042CC1D">
           <v:rect id="_x0000_i1039" style="width:468pt;height:1.5pt" o:hralign="center" o:hrstd="t" o:hrnoshade="t" o:hr="t" fillcolor="#974706 [1609]" stroked="f"/>
         </w:pict>
       </w:r>
@@ -1994,6 +2023,7 @@
             <w14:uncheckedState w14:val="2610" w14:font="MS Gothic"/>
           </w14:checkbox>
         </w:sdtPr>
+        <w:sdtEndPr/>
         <w:sdtContent>
           <w:r>
             <w:rPr>
@@ -2028,6 +2058,7 @@
             <w14:uncheckedState w14:val="2610" w14:font="MS Gothic"/>
           </w14:checkbox>
         </w:sdtPr>
+        <w:sdtEndPr/>
         <w:sdtContent>
           <w:r>
             <w:rPr>
@@ -2062,6 +2093,7 @@
             <w14:uncheckedState w14:val="2610" w14:font="MS Gothic"/>
           </w14:checkbox>
         </w:sdtPr>
+        <w:sdtEndPr/>
         <w:sdtContent>
           <w:r>
             <w:rPr>
@@ -2096,6 +2128,7 @@
             <w14:uncheckedState w14:val="2610" w14:font="MS Gothic"/>
           </w14:checkbox>
         </w:sdtPr>
+        <w:sdtEndPr/>
         <w:sdtContent>
           <w:r>
             <w:rPr>
@@ -2230,7 +2263,7 @@
     </w:p>
     <w:p>
       <w:r>
-        <w:pict>
+        <w:pict w14:anchorId="0D9D4A1B">
           <v:rect id="_x0000_i1040" style="width:468pt;height:1.5pt" o:hralign="center" o:hrstd="t" o:hrnoshade="t" o:hr="t" fillcolor="#974706 [1609]" stroked="f"/>
         </w:pict>
       </w:r>
@@ -2272,6 +2305,7 @@
             <w14:uncheckedState w14:val="2610" w14:font="MS Gothic"/>
           </w14:checkbox>
         </w:sdtPr>
+        <w:sdtEndPr/>
         <w:sdtContent>
           <w:r>
             <w:rPr>
@@ -2315,6 +2349,7 @@
             <w14:uncheckedState w14:val="2610" w14:font="MS Gothic"/>
           </w14:checkbox>
         </w:sdtPr>
+        <w:sdtEndPr/>
         <w:sdtContent>
           <w:r>
             <w:rPr>
@@ -2349,6 +2384,7 @@
             <w14:uncheckedState w14:val="2610" w14:font="MS Gothic"/>
           </w14:checkbox>
         </w:sdtPr>
+        <w:sdtEndPr/>
         <w:sdtContent>
           <w:r>
             <w:rPr>
@@ -2378,7 +2414,7 @@
         <w:rPr>
           <w:color w:val="4F6228" w:themeColor="accent3" w:themeShade="80"/>
         </w:rPr>
-        <w:pict>
+        <w:pict w14:anchorId="6630B1EB">
           <v:rect id="_x0000_i1041" style="width:468pt;height:2pt" o:hralign="center" o:hrstd="t" o:hrnoshade="t" o:hr="t" fillcolor="#4e6128 [1606]" stroked="f"/>
         </w:pict>
       </w:r>
@@ -2490,7 +2526,7 @@
         <w:pStyle w:val="Heading4"/>
       </w:pPr>
       <w:r>
-        <w:pict>
+        <w:pict w14:anchorId="7526627A">
           <v:rect id="_x0000_i1042" style="width:468pt;height:1.5pt" o:hralign="center" o:hrstd="t" o:hrnoshade="t" o:hr="t" fillcolor="#974706 [1609]" stroked="f"/>
         </w:pict>
       </w:r>
@@ -2519,6 +2555,7 @@
             <w14:uncheckedState w14:val="2610" w14:font="MS Gothic"/>
           </w14:checkbox>
         </w:sdtPr>
+        <w:sdtEndPr/>
         <w:sdtContent>
           <w:r>
             <w:rPr>
@@ -2885,20 +2922,12 @@
         <w:t>Enterprise Network Standards Guide</w:t>
       </w:r>
       <w:r>
-        <w:t xml:space="preserve"> should be created on the switches, but their associated access ports should remain </w:t>
-      </w:r>
-      <w:proofErr w:type="spellStart"/>
-      <w:r>
-        <w:t>unconfigured</w:t>
-      </w:r>
-      <w:proofErr w:type="spellEnd"/>
-      <w:r>
-        <w:t xml:space="preserve"> until directed by a future Enterprise Change Request (ECR).</w:t>
-      </w:r>
-    </w:p>
-    <w:p>
-      <w:r>
-        <w:pict>
+        <w:t xml:space="preserve"> should be created on the switches, but their associated access ports should remain unconfigured until directed by a future Enterprise Change Request (ECR).</w:t>
+      </w:r>
+    </w:p>
+    <w:p>
+      <w:r>
+        <w:pict w14:anchorId="5C9CE7EB">
           <v:rect id="_x0000_i1043" style="width:468pt;height:1.5pt" o:hralign="center" o:hrstd="t" o:hrnoshade="t" o:hr="t" fillcolor="#974706 [1609]" stroked="f"/>
         </w:pict>
       </w:r>
@@ -2933,6 +2962,7 @@
             <w14:uncheckedState w14:val="2610" w14:font="MS Gothic"/>
           </w14:checkbox>
         </w:sdtPr>
+        <w:sdtEndPr/>
         <w:sdtContent>
           <w:r>
             <w:rPr>
@@ -2992,14 +3022,12 @@
       <w:r>
         <w:t xml:space="preserve">. The remaining uplink interfaces will remain administratively shut down and will be configured as an </w:t>
       </w:r>
-      <w:proofErr w:type="spellStart"/>
       <w:r>
         <w:rPr>
           <w:rStyle w:val="Strong"/>
         </w:rPr>
         <w:t>EtherChannel</w:t>
       </w:r>
-      <w:proofErr w:type="spellEnd"/>
       <w:r>
         <w:t xml:space="preserve"> in a future Enterprise Change Request.</w:t>
       </w:r>
@@ -3197,21 +3225,7 @@
         <w:rPr>
           <w:b w:val="0"/>
         </w:rPr>
-        <w:t xml:space="preserve">Activating multiple parallel switch links without configuring </w:t>
-      </w:r>
-      <w:proofErr w:type="spellStart"/>
-      <w:r>
-        <w:rPr>
-          <w:b w:val="0"/>
-        </w:rPr>
-        <w:t>EtherChannel</w:t>
-      </w:r>
-      <w:proofErr w:type="spellEnd"/>
-      <w:r>
-        <w:rPr>
-          <w:b w:val="0"/>
-        </w:rPr>
-        <w:t xml:space="preserve"> creates Layer 2 loops. During </w:t>
+        <w:t xml:space="preserve">Activating multiple parallel switch links without configuring EtherChannel creates Layer 2 loops. During </w:t>
       </w:r>
       <w:r>
         <w:rPr>
@@ -3249,21 +3263,7 @@
         <w:rPr>
           <w:b w:val="0"/>
         </w:rPr>
-        <w:t xml:space="preserve">remain administratively shut down until </w:t>
-      </w:r>
-      <w:proofErr w:type="spellStart"/>
-      <w:r>
-        <w:rPr>
-          <w:b w:val="0"/>
-        </w:rPr>
-        <w:t>EtherChannel</w:t>
-      </w:r>
-      <w:proofErr w:type="spellEnd"/>
-      <w:r>
-        <w:rPr>
-          <w:b w:val="0"/>
-        </w:rPr>
-        <w:t xml:space="preserve"> is implemented in a future Enterprise Change Request.</w:t>
+        <w:t>remain administratively shut down until EtherChannel is implemented in a future Enterprise Change Request.</w:t>
       </w:r>
     </w:p>
     <w:p>
@@ -3285,7 +3285,7 @@
     </w:p>
     <w:p>
       <w:r>
-        <w:pict>
+        <w:pict w14:anchorId="0A79F71E">
           <v:rect id="_x0000_i1044" style="width:468pt;height:1.5pt" o:hralign="center" o:hrstd="t" o:hrnoshade="t" o:hr="t" fillcolor="#974706 [1609]" stroked="f"/>
         </w:pict>
       </w:r>
@@ -3314,6 +3314,7 @@
             <w14:uncheckedState w14:val="2610" w14:font="MS Gothic"/>
           </w14:checkbox>
         </w:sdtPr>
+        <w:sdtEndPr/>
         <w:sdtContent>
           <w:r>
             <w:rPr>
@@ -3452,7 +3453,7 @@
     </w:p>
     <w:p>
       <w:r>
-        <w:pict>
+        <w:pict w14:anchorId="0409FE16">
           <v:rect id="_x0000_i1045" style="width:468pt;height:1.5pt" o:hralign="center" o:hrstd="t" o:hrnoshade="t" o:hr="t" fillcolor="#974706 [1609]" stroked="f"/>
         </w:pict>
       </w:r>
@@ -3484,6 +3485,7 @@
             <w14:uncheckedState w14:val="2610" w14:font="MS Gothic"/>
           </w14:checkbox>
         </w:sdtPr>
+        <w:sdtEndPr/>
         <w:sdtContent>
           <w:r>
             <w:rPr>
@@ -3595,15 +3597,7 @@
         <w:spacing w:after="240"/>
       </w:pPr>
       <w:r>
-        <w:t xml:space="preserve">Install end devices only for the departments identified in Step 1. Reserved ports and future expansion ports should remain </w:t>
-      </w:r>
-      <w:proofErr w:type="spellStart"/>
-      <w:r>
-        <w:t>unconfigured</w:t>
-      </w:r>
-      <w:proofErr w:type="spellEnd"/>
-      <w:r>
-        <w:t xml:space="preserve"> until implemented in a future Enterprise Change Request (ECR).</w:t>
+        <w:t>Install end devices only for the departments identified in Step 1. Reserved ports and future expansion ports should remain unconfigured until implemented in a future Enterprise Change Request (ECR).</w:t>
       </w:r>
     </w:p>
     <w:p>
@@ -3612,7 +3606,7 @@
       </w:pPr>
       <w:r>
         <w:lastRenderedPageBreak/>
-        <w:pict>
+        <w:pict w14:anchorId="0E6550B6">
           <v:rect id="_x0000_i1046" style="width:468pt;height:1.5pt" o:hralign="center" o:hrstd="t" o:hrnoshade="t" o:hr="t" fillcolor="#974706 [1609]" stroked="f"/>
         </w:pict>
       </w:r>
@@ -3641,6 +3635,7 @@
             <w14:uncheckedState w14:val="2610" w14:font="MS Gothic"/>
           </w14:checkbox>
         </w:sdtPr>
+        <w:sdtEndPr/>
         <w:sdtContent>
           <w:r>
             <w:rPr>
@@ -3737,7 +3732,7 @@
         <w:rPr>
           <w:color w:val="4F6228" w:themeColor="accent3" w:themeShade="80"/>
         </w:rPr>
-        <w:pict>
+        <w:pict w14:anchorId="5FD60ADD">
           <v:rect id="_x0000_i1047" style="width:468pt;height:2pt" o:hralign="center" o:hrstd="t" o:hrnoshade="t" o:hr="t" fillcolor="#4e6128 [1606]" stroked="f"/>
         </w:pict>
       </w:r>
@@ -3791,7 +3786,7 @@
         <w:spacing w:before="100" w:beforeAutospacing="1" w:after="100" w:afterAutospacing="1"/>
       </w:pPr>
       <w:r>
-        <w:pict>
+        <w:pict w14:anchorId="316BBBB1">
           <v:rect id="_x0000_i1048" style="width:468pt;height:1.5pt" o:hralign="center" o:hrstd="t" o:hrnoshade="t" o:hr="t" fillcolor="#974706 [1609]" stroked="f"/>
         </w:pict>
       </w:r>
@@ -3817,6 +3812,7 @@
             <w14:uncheckedState w14:val="2610" w14:font="MS Gothic"/>
           </w14:checkbox>
         </w:sdtPr>
+        <w:sdtEndPr/>
         <w:sdtContent>
           <w:r>
             <w:rPr>
@@ -3914,7 +3910,7 @@
     <w:p>
       <w:r>
         <w:lastRenderedPageBreak/>
-        <w:pict>
+        <w:pict w14:anchorId="0D0C555D">
           <v:rect id="_x0000_i1049" style="width:468pt;height:1.5pt" o:hralign="center" o:hrstd="t" o:hrnoshade="t" o:hr="t" fillcolor="#974706 [1609]" stroked="f"/>
         </w:pict>
       </w:r>
@@ -3940,6 +3936,7 @@
             <w14:uncheckedState w14:val="2610" w14:font="MS Gothic"/>
           </w14:checkbox>
         </w:sdtPr>
+        <w:sdtEndPr/>
         <w:sdtContent>
           <w:r>
             <w:rPr>
@@ -4036,7 +4033,7 @@
     </w:p>
     <w:p>
       <w:r>
-        <w:pict>
+        <w:pict w14:anchorId="2D337F04">
           <v:rect id="_x0000_i1050" style="width:468pt;height:1.5pt" o:hralign="center" o:hrstd="t" o:hrnoshade="t" o:hr="t" fillcolor="#974706 [1609]" stroked="f"/>
         </w:pict>
       </w:r>
@@ -4062,6 +4059,7 @@
             <w14:uncheckedState w14:val="2610" w14:font="MS Gothic"/>
           </w14:checkbox>
         </w:sdtPr>
+        <w:sdtEndPr/>
         <w:sdtContent>
           <w:r>
             <w:rPr>
@@ -4160,7 +4158,7 @@
         <w:rPr>
           <w:color w:val="4F6228" w:themeColor="accent3" w:themeShade="80"/>
         </w:rPr>
-        <w:pict>
+        <w:pict w14:anchorId="2B9C9911">
           <v:rect id="_x0000_i1051" style="width:468pt;height:2pt" o:hralign="center" o:hrstd="t" o:hrnoshade="t" o:hr="t" fillcolor="#4e6128 [1606]" stroked="f"/>
         </w:pict>
       </w:r>
@@ -4221,7 +4219,7 @@
       </w:pPr>
       <w:r>
         <w:lastRenderedPageBreak/>
-        <w:pict>
+        <w:pict w14:anchorId="31A8E822">
           <v:rect id="_x0000_i1052" style="width:468pt;height:1.5pt" o:hralign="center" o:hrstd="t" o:hrnoshade="t" o:hr="t" fillcolor="#974706 [1609]" stroked="f"/>
         </w:pict>
       </w:r>
@@ -4247,6 +4245,7 @@
             <w14:uncheckedState w14:val="2610" w14:font="MS Gothic"/>
           </w14:checkbox>
         </w:sdtPr>
+        <w:sdtEndPr/>
         <w:sdtContent>
           <w:r>
             <w:rPr>
@@ -4319,7 +4318,7 @@
     </w:p>
     <w:p>
       <w:r>
-        <w:pict>
+        <w:pict w14:anchorId="37DE3AB7">
           <v:rect id="_x0000_i1053" style="width:468pt;height:1.5pt" o:hralign="center" o:hrstd="t" o:hrnoshade="t" o:hr="t" fillcolor="#974706 [1609]" stroked="f"/>
         </w:pict>
       </w:r>
@@ -4345,6 +4344,7 @@
             <w14:uncheckedState w14:val="2610" w14:font="MS Gothic"/>
           </w14:checkbox>
         </w:sdtPr>
+        <w:sdtEndPr/>
         <w:sdtContent>
           <w:r>
             <w:rPr>
@@ -4417,7 +4417,7 @@
     </w:p>
     <w:p>
       <w:r>
-        <w:pict>
+        <w:pict w14:anchorId="637F5A91">
           <v:rect id="_x0000_i1054" style="width:468pt;height:1.5pt" o:hralign="center" o:hrstd="t" o:hrnoshade="t" o:hr="t" fillcolor="#974706 [1609]" stroked="f"/>
         </w:pict>
       </w:r>
@@ -4443,6 +4443,7 @@
             <w14:uncheckedState w14:val="2610" w14:font="MS Gothic"/>
           </w14:checkbox>
         </w:sdtPr>
+        <w:sdtEndPr/>
         <w:sdtContent>
           <w:r>
             <w:rPr>
@@ -4515,7 +4516,7 @@
     </w:p>
     <w:p>
       <w:r>
-        <w:pict>
+        <w:pict w14:anchorId="27C24F95">
           <v:rect id="_x0000_i1055" style="width:468pt;height:1.5pt" o:hralign="center" o:hrstd="t" o:hrnoshade="t" o:hr="t" fillcolor="#974706 [1609]" stroked="f"/>
         </w:pict>
       </w:r>
@@ -4541,6 +4542,7 @@
             <w14:uncheckedState w14:val="2610" w14:font="MS Gothic"/>
           </w14:checkbox>
         </w:sdtPr>
+        <w:sdtEndPr/>
         <w:sdtContent>
           <w:r>
             <w:rPr>
@@ -4626,7 +4628,7 @@
         <w:rPr>
           <w:color w:val="4F6228" w:themeColor="accent3" w:themeShade="80"/>
         </w:rPr>
-        <w:pict>
+        <w:pict w14:anchorId="6473D7FA">
           <v:rect id="_x0000_i1056" style="width:468pt;height:2pt" o:hralign="center" o:hrstd="t" o:hrnoshade="t" o:hr="t" fillcolor="#4e6128 [1606]" stroked="f"/>
         </w:pict>
       </w:r>
@@ -4785,7 +4787,7 @@
         <w:spacing w:before="100" w:beforeAutospacing="1" w:after="100" w:afterAutospacing="1"/>
       </w:pPr>
       <w:r>
-        <w:pict>
+        <w:pict w14:anchorId="4B316B49">
           <v:rect id="_x0000_i1057" style="width:468pt;height:1.5pt" o:hralign="center" o:hrstd="t" o:hrnoshade="t" o:hr="t" fillcolor="#974706 [1609]" stroked="f"/>
         </w:pict>
       </w:r>
@@ -4811,6 +4813,7 @@
             <w14:uncheckedState w14:val="2610" w14:font="MS Gothic"/>
           </w14:checkbox>
         </w:sdtPr>
+        <w:sdtEndPr/>
         <w:sdtContent>
           <w:r>
             <w:rPr>
@@ -4909,19 +4912,11 @@
       <w:r>
         <w:br/>
       </w:r>
-      <w:proofErr w:type="gramStart"/>
       <w:r>
         <w:rPr>
           <w:b w:val="0"/>
         </w:rPr>
-        <w:t>Your</w:t>
-      </w:r>
-      <w:proofErr w:type="gramEnd"/>
-      <w:r>
-        <w:rPr>
-          <w:b w:val="0"/>
-        </w:rPr>
-        <w:t xml:space="preserve"> validation package must clearly document the source of each connectivity test. Every screenshot must include</w:t>
+        <w:t>Your validation package must clearly document the source of each connectivity test. Every screenshot must include</w:t>
       </w:r>
       <w:r>
         <w:t xml:space="preserve"> </w:t>
@@ -5736,7 +5731,7 @@
     <w:p/>
     <w:p>
       <w:r>
-        <w:pict>
+        <w:pict w14:anchorId="41EDA4B7">
           <v:rect id="_x0000_i1058" style="width:468pt;height:1.5pt" o:hralign="center" o:hrstd="t" o:hrnoshade="t" o:hr="t" fillcolor="#974706 [1609]" stroked="f"/>
         </w:pict>
       </w:r>
@@ -5768,6 +5763,7 @@
             <w14:uncheckedState w14:val="2610" w14:font="MS Gothic"/>
           </w14:checkbox>
         </w:sdtPr>
+        <w:sdtEndPr/>
         <w:sdtContent>
           <w:r>
             <w:rPr>
@@ -5824,23 +5820,13 @@
           <w:szCs w:val="32"/>
         </w:rPr>
       </w:pPr>
-      <w:proofErr w:type="gramStart"/>
       <w:r>
         <w:rPr>
           <w:rFonts w:ascii="Courier New" w:hAnsi="Courier New" w:cs="Courier New"/>
           <w:sz w:val="32"/>
           <w:szCs w:val="32"/>
         </w:rPr>
-        <w:t>show</w:t>
-      </w:r>
-      <w:proofErr w:type="gramEnd"/>
-      <w:r>
-        <w:rPr>
-          <w:rFonts w:ascii="Courier New" w:hAnsi="Courier New" w:cs="Courier New"/>
-          <w:sz w:val="32"/>
-          <w:szCs w:val="32"/>
-        </w:rPr>
-        <w:t xml:space="preserve"> </w:t>
+        <w:t xml:space="preserve">show </w:t>
       </w:r>
       <w:proofErr w:type="spellStart"/>
       <w:r>
@@ -6110,7 +6096,7 @@
     <w:p/>
     <w:p>
       <w:r>
-        <w:pict>
+        <w:pict w14:anchorId="54D4C81C">
           <v:rect id="_x0000_i1059" style="width:468pt;height:1.5pt" o:hralign="center" o:hrstd="t" o:hrnoshade="t" o:hr="t" fillcolor="#974706 [1609]" stroked="f"/>
         </w:pict>
       </w:r>
@@ -6142,6 +6128,7 @@
             <w14:uncheckedState w14:val="2610" w14:font="MS Gothic"/>
           </w14:checkbox>
         </w:sdtPr>
+        <w:sdtEndPr/>
         <w:sdtContent>
           <w:r>
             <w:rPr>
@@ -6174,23 +6161,13 @@
           <w:szCs w:val="32"/>
         </w:rPr>
       </w:pPr>
-      <w:proofErr w:type="gramStart"/>
       <w:r>
         <w:rPr>
           <w:rStyle w:val="HTMLCode"/>
           <w:sz w:val="32"/>
           <w:szCs w:val="32"/>
         </w:rPr>
-        <w:t>show</w:t>
-      </w:r>
-      <w:proofErr w:type="gramEnd"/>
-      <w:r>
-        <w:rPr>
-          <w:rStyle w:val="HTMLCode"/>
-          <w:sz w:val="32"/>
-          <w:szCs w:val="32"/>
-        </w:rPr>
-        <w:t xml:space="preserve"> </w:t>
+        <w:t xml:space="preserve">show </w:t>
       </w:r>
       <w:proofErr w:type="spellStart"/>
       <w:r>
@@ -6432,7 +6409,7 @@
     <w:p/>
     <w:p>
       <w:r>
-        <w:pict>
+        <w:pict w14:anchorId="020DCCE4">
           <v:rect id="_x0000_i1060" style="width:468pt;height:1.5pt" o:hralign="center" o:hrstd="t" o:hrnoshade="t" o:hr="t" fillcolor="#974706 [1609]" stroked="f"/>
         </w:pict>
       </w:r>
@@ -6464,6 +6441,7 @@
             <w14:uncheckedState w14:val="2610" w14:font="MS Gothic"/>
           </w14:checkbox>
         </w:sdtPr>
+        <w:sdtEndPr/>
         <w:sdtContent>
           <w:r>
             <w:rPr>
@@ -6493,46 +6471,21 @@
           <w:szCs w:val="32"/>
         </w:rPr>
       </w:pPr>
-      <w:proofErr w:type="gramStart"/>
       <w:r>
         <w:rPr>
           <w:rStyle w:val="HTMLCode"/>
           <w:sz w:val="32"/>
           <w:szCs w:val="32"/>
         </w:rPr>
-        <w:t>show</w:t>
-      </w:r>
-      <w:proofErr w:type="gramEnd"/>
-      <w:r>
-        <w:rPr>
-          <w:rStyle w:val="HTMLCode"/>
-          <w:sz w:val="32"/>
-          <w:szCs w:val="32"/>
-        </w:rPr>
-        <w:t xml:space="preserve"> running-</w:t>
-      </w:r>
-      <w:proofErr w:type="spellStart"/>
-      <w:r>
-        <w:rPr>
-          <w:rStyle w:val="HTMLCode"/>
-          <w:sz w:val="32"/>
-          <w:szCs w:val="32"/>
-        </w:rPr>
-        <w:t>config</w:t>
-      </w:r>
-      <w:proofErr w:type="spellEnd"/>
+        <w:t>show running-config</w:t>
+      </w:r>
     </w:p>
     <w:p>
       <w:pPr>
         <w:pStyle w:val="NormalWeb"/>
       </w:pPr>
-      <w:proofErr w:type="gramStart"/>
-      <w:r>
-        <w:t>for</w:t>
-      </w:r>
-      <w:proofErr w:type="gramEnd"/>
-      <w:r>
-        <w:t xml:space="preserve"> every router and switch.</w:t>
+      <w:r>
+        <w:t>for every router and switch.</w:t>
       </w:r>
     </w:p>
     <w:p>
@@ -6556,18 +6509,8 @@
           <w:b/>
           <w:bCs/>
         </w:rPr>
-        <w:t>Important</w:t>
-      </w:r>
-      <w:proofErr w:type="gramStart"/>
-      <w:r>
-        <w:rPr>
-          <w:rStyle w:val="Strong"/>
-          <w:b/>
-          <w:bCs/>
-        </w:rPr>
-        <w:t>:</w:t>
-      </w:r>
-      <w:proofErr w:type="gramEnd"/>
+        <w:t>Important:</w:t>
+      </w:r>
       <w:r>
         <w:br/>
       </w:r>
@@ -6582,17 +6525,8 @@
           <w:rStyle w:val="HTMLCode"/>
           <w:b w:val="0"/>
         </w:rPr>
-        <w:t>show running-</w:t>
-      </w:r>
-      <w:proofErr w:type="spellStart"/>
-      <w:r>
-        <w:rPr>
-          <w:rStyle w:val="HTMLCode"/>
-          <w:b w:val="0"/>
-        </w:rPr>
-        <w:t>config</w:t>
-      </w:r>
-      <w:proofErr w:type="spellEnd"/>
+        <w:t>show running-config</w:t>
+      </w:r>
       <w:r>
         <w:rPr>
           <w:b w:val="0"/>
@@ -6728,18 +6662,8 @@
                 <w:sz w:val="28"/>
                 <w:szCs w:val="28"/>
               </w:rPr>
-              <w:t>show running-</w:t>
+              <w:t>show running-config</w:t>
             </w:r>
-            <w:proofErr w:type="spellStart"/>
-            <w:r>
-              <w:rPr>
-                <w:rFonts w:ascii="Courier New" w:hAnsi="Courier New" w:cs="Courier New"/>
-                <w:sz w:val="28"/>
-                <w:szCs w:val="28"/>
-              </w:rPr>
-              <w:t>config</w:t>
-            </w:r>
-            <w:proofErr w:type="spellEnd"/>
           </w:p>
         </w:tc>
       </w:tr>
@@ -6916,7 +6840,7 @@
     <w:p/>
     <w:p>
       <w:r>
-        <w:pict>
+        <w:pict w14:anchorId="6679FDD3">
           <v:rect id="_x0000_i1061" style="width:468pt;height:1.5pt" o:hralign="center" o:hrstd="t" o:hrnoshade="t" o:hr="t" fillcolor="#974706 [1609]" stroked="f"/>
         </w:pict>
       </w:r>
@@ -7004,7 +6928,7 @@
         <w:rPr>
           <w:color w:val="4F6228" w:themeColor="accent3" w:themeShade="80"/>
         </w:rPr>
-        <w:pict>
+        <w:pict w14:anchorId="710B6DEE">
           <v:rect id="_x0000_i1062" style="width:468pt;height:2pt" o:hralign="center" o:hrstd="t" o:hrnoshade="t" o:hr="t" fillcolor="#4e6128 [1606]" stroked="f"/>
         </w:pict>
       </w:r>
@@ -7020,7 +6944,6 @@
         <w:t>eliverables</w:t>
       </w:r>
     </w:p>
-    <w:bookmarkStart w:id="0" w:name="_GoBack"/>
     <w:p>
       <w:pPr>
         <w:pStyle w:val="NoSpacing"/>
@@ -7035,6 +6958,7 @@
             <w14:uncheckedState w14:val="2610" w14:font="MS Gothic"/>
           </w14:checkbox>
         </w:sdtPr>
+        <w:sdtEndPr/>
         <w:sdtContent>
           <w:r>
             <w:rPr>
@@ -7065,6 +6989,7 @@
             <w14:uncheckedState w14:val="2610" w14:font="MS Gothic"/>
           </w14:checkbox>
         </w:sdtPr>
+        <w:sdtEndPr/>
         <w:sdtContent>
           <w:r>
             <w:rPr>
@@ -7095,6 +7020,7 @@
             <w14:uncheckedState w14:val="2610" w14:font="MS Gothic"/>
           </w14:checkbox>
         </w:sdtPr>
+        <w:sdtEndPr/>
         <w:sdtContent>
           <w:r>
             <w:rPr>
@@ -7132,6 +7058,7 @@
             <w14:uncheckedState w14:val="2610" w14:font="MS Gothic"/>
           </w14:checkbox>
         </w:sdtPr>
+        <w:sdtEndPr/>
         <w:sdtContent>
           <w:r>
             <w:rPr>
@@ -7156,22 +7083,16 @@
       </w:r>
       <w:proofErr w:type="spellEnd"/>
       <w:r>
-        <w:t>, depending on the assignment</w:t>
-      </w:r>
-      <w:proofErr w:type="gramStart"/>
-      <w:r>
-        <w:t>)</w:t>
-      </w:r>
-      <w:proofErr w:type="gramEnd"/>
+        <w:t>, depending on the assignment)</w:t>
+      </w:r>
       <w:r>
         <w:rPr>
           <w:color w:val="4F6228" w:themeColor="accent3" w:themeShade="80"/>
         </w:rPr>
-        <w:pict>
+        <w:pict w14:anchorId="5E8531FB">
           <v:rect id="_x0000_i1063" style="width:468pt;height:2pt" o:hralign="center" o:hrstd="t" o:hrnoshade="t" o:hr="t" fillcolor="#4e6128 [1606]" stroked="f"/>
         </w:pict>
       </w:r>
-      <w:bookmarkEnd w:id="0"/>
       <w:r>
         <w:rPr>
           <w:color w:val="4F6228" w:themeColor="accent3" w:themeShade="80"/>
@@ -7214,7 +7135,7 @@
 </file>
 
 <file path=word/endnotes.xml><?xml version="1.0" encoding="utf-8"?>
-<w:endnotes xmlns:wpc="http://schemas.microsoft.com/office/word/2010/wordprocessingCanvas" xmlns:mc="http://schemas.openxmlformats.org/markup-compatibility/2006" xmlns:o="urn:schemas-microsoft-com:office:office" xmlns:r="http://schemas.openxmlformats.org/officeDocument/2006/relationships" xmlns:m="http://schemas.openxmlformats.org/officeDocument/2006/math" xmlns:v="urn:schemas-microsoft-com:vml" xmlns:wp14="http://schemas.microsoft.com/office/word/2010/wordprocessingDrawing" xmlns:wp="http://schemas.openxmlformats.org/drawingml/2006/wordprocessingDrawing" xmlns:w10="urn:schemas-microsoft-com:office:word" xmlns:w="http://schemas.openxmlformats.org/wordprocessingml/2006/main" xmlns:w14="http://schemas.microsoft.com/office/word/2010/wordml" xmlns:w15="http://schemas.microsoft.com/office/word/2012/wordml" xmlns:wpg="http://schemas.microsoft.com/office/word/2010/wordprocessingGroup" xmlns:wpi="http://schemas.microsoft.com/office/word/2010/wordprocessingInk" xmlns:wne="http://schemas.microsoft.com/office/word/2006/wordml" xmlns:wps="http://schemas.microsoft.com/office/word/2010/wordprocessingShape" mc:Ignorable="w14 w15 wp14">
+<w:endnotes xmlns:wpc="http://schemas.microsoft.com/office/word/2010/wordprocessingCanvas" xmlns:cx="http://schemas.microsoft.com/office/drawing/2014/chartex" xmlns:cx1="http://schemas.microsoft.com/office/drawing/2015/9/8/chartex" xmlns:cx2="http://schemas.microsoft.com/office/drawing/2015/10/21/chartex" xmlns:cx3="http://schemas.microsoft.com/office/drawing/2016/5/9/chartex" xmlns:cx4="http://schemas.microsoft.com/office/drawing/2016/5/10/chartex" xmlns:cx5="http://schemas.microsoft.com/office/drawing/2016/5/11/chartex" xmlns:cx6="http://schemas.microsoft.com/office/drawing/2016/5/12/chartex" xmlns:cx7="http://schemas.microsoft.com/office/drawing/2016/5/13/chartex" xmlns:cx8="http://schemas.microsoft.com/office/drawing/2016/5/14/chartex" xmlns:mc="http://schemas.openxmlformats.org/markup-compatibility/2006" xmlns:aink="http://schemas.microsoft.com/office/drawing/2016/ink" xmlns:am3d="http://schemas.microsoft.com/office/drawing/2017/model3d" xmlns:o="urn:schemas-microsoft-com:office:office" xmlns:r="http://schemas.openxmlformats.org/officeDocument/2006/relationships" xmlns:m="http://schemas.openxmlformats.org/officeDocument/2006/math" xmlns:v="urn:schemas-microsoft-com:vml" xmlns:wp14="http://schemas.microsoft.com/office/word/2010/wordprocessingDrawing" xmlns:wp="http://schemas.openxmlformats.org/drawingml/2006/wordprocessingDrawing" xmlns:w10="urn:schemas-microsoft-com:office:word" xmlns:w="http://schemas.openxmlformats.org/wordprocessingml/2006/main" xmlns:w14="http://schemas.microsoft.com/office/word/2010/wordml" xmlns:w15="http://schemas.microsoft.com/office/word/2012/wordml" xmlns:w16cex="http://schemas.microsoft.com/office/word/2018/wordml/cex" xmlns:w16cid="http://schemas.microsoft.com/office/word/2016/wordml/cid" xmlns:w16="http://schemas.microsoft.com/office/word/2018/wordml" xmlns:w16sdtdh="http://schemas.microsoft.com/office/word/2020/wordml/sdtdatahash" xmlns:w16se="http://schemas.microsoft.com/office/word/2015/wordml/symex" xmlns:wpg="http://schemas.microsoft.com/office/word/2010/wordprocessingGroup" xmlns:wpi="http://schemas.microsoft.com/office/word/2010/wordprocessingInk" xmlns:wne="http://schemas.microsoft.com/office/word/2006/wordml" xmlns:wps="http://schemas.microsoft.com/office/word/2010/wordprocessingShape" mc:Ignorable="w14 w15 w16se w16cid w16 w16cex w16sdtdh wp14">
   <w:endnote w:type="separator" w:id="-1">
     <w:p>
       <w:r>
@@ -7233,7 +7154,7 @@
 </file>
 
 <file path=word/footer1.xml><?xml version="1.0" encoding="utf-8"?>
-<w:ftr xmlns:wpc="http://schemas.microsoft.com/office/word/2010/wordprocessingCanvas" xmlns:mc="http://schemas.openxmlformats.org/markup-compatibility/2006" xmlns:o="urn:schemas-microsoft-com:office:office" xmlns:r="http://schemas.openxmlformats.org/officeDocument/2006/relationships" xmlns:m="http://schemas.openxmlformats.org/officeDocument/2006/math" xmlns:v="urn:schemas-microsoft-com:vml" xmlns:wp14="http://schemas.microsoft.com/office/word/2010/wordprocessingDrawing" xmlns:wp="http://schemas.openxmlformats.org/drawingml/2006/wordprocessingDrawing" xmlns:w10="urn:schemas-microsoft-com:office:word" xmlns:w="http://schemas.openxmlformats.org/wordprocessingml/2006/main" xmlns:w14="http://schemas.microsoft.com/office/word/2010/wordml" xmlns:w15="http://schemas.microsoft.com/office/word/2012/wordml" xmlns:wpg="http://schemas.microsoft.com/office/word/2010/wordprocessingGroup" xmlns:wpi="http://schemas.microsoft.com/office/word/2010/wordprocessingInk" xmlns:wne="http://schemas.microsoft.com/office/word/2006/wordml" xmlns:wps="http://schemas.microsoft.com/office/word/2010/wordprocessingShape" mc:Ignorable="w14 w15 wp14">
+<w:ftr xmlns:wpc="http://schemas.microsoft.com/office/word/2010/wordprocessingCanvas" xmlns:cx="http://schemas.microsoft.com/office/drawing/2014/chartex" xmlns:cx1="http://schemas.microsoft.com/office/drawing/2015/9/8/chartex" xmlns:cx2="http://schemas.microsoft.com/office/drawing/2015/10/21/chartex" xmlns:cx3="http://schemas.microsoft.com/office/drawing/2016/5/9/chartex" xmlns:cx4="http://schemas.microsoft.com/office/drawing/2016/5/10/chartex" xmlns:cx5="http://schemas.microsoft.com/office/drawing/2016/5/11/chartex" xmlns:cx6="http://schemas.microsoft.com/office/drawing/2016/5/12/chartex" xmlns:cx7="http://schemas.microsoft.com/office/drawing/2016/5/13/chartex" xmlns:cx8="http://schemas.microsoft.com/office/drawing/2016/5/14/chartex" xmlns:mc="http://schemas.openxmlformats.org/markup-compatibility/2006" xmlns:aink="http://schemas.microsoft.com/office/drawing/2016/ink" xmlns:am3d="http://schemas.microsoft.com/office/drawing/2017/model3d" xmlns:o="urn:schemas-microsoft-com:office:office" xmlns:r="http://schemas.openxmlformats.org/officeDocument/2006/relationships" xmlns:m="http://schemas.openxmlformats.org/officeDocument/2006/math" xmlns:v="urn:schemas-microsoft-com:vml" xmlns:wp14="http://schemas.microsoft.com/office/word/2010/wordprocessingDrawing" xmlns:wp="http://schemas.openxmlformats.org/drawingml/2006/wordprocessingDrawing" xmlns:w10="urn:schemas-microsoft-com:office:word" xmlns:w="http://schemas.openxmlformats.org/wordprocessingml/2006/main" xmlns:w14="http://schemas.microsoft.com/office/word/2010/wordml" xmlns:w15="http://schemas.microsoft.com/office/word/2012/wordml" xmlns:w16cex="http://schemas.microsoft.com/office/word/2018/wordml/cex" xmlns:w16cid="http://schemas.microsoft.com/office/word/2016/wordml/cid" xmlns:w16="http://schemas.microsoft.com/office/word/2018/wordml" xmlns:w16sdtdh="http://schemas.microsoft.com/office/word/2020/wordml/sdtdatahash" xmlns:w16se="http://schemas.microsoft.com/office/word/2015/wordml/symex" xmlns:wpg="http://schemas.microsoft.com/office/word/2010/wordprocessingGroup" xmlns:wpi="http://schemas.microsoft.com/office/word/2010/wordprocessingInk" xmlns:wne="http://schemas.microsoft.com/office/word/2006/wordml" xmlns:wps="http://schemas.microsoft.com/office/word/2010/wordprocessingShape" mc:Ignorable="w14 w15 w16se w16cid w16 w16cex w16sdtdh wp14">
   <w:p>
     <w:pPr>
       <w:pStyle w:val="Footer"/>
@@ -7243,7 +7164,7 @@
 </file>
 
 <file path=word/footer2.xml><?xml version="1.0" encoding="utf-8"?>
-<w:ftr xmlns:wpc="http://schemas.microsoft.com/office/word/2010/wordprocessingCanvas" xmlns:mc="http://schemas.openxmlformats.org/markup-compatibility/2006" xmlns:o="urn:schemas-microsoft-com:office:office" xmlns:r="http://schemas.openxmlformats.org/officeDocument/2006/relationships" xmlns:m="http://schemas.openxmlformats.org/officeDocument/2006/math" xmlns:v="urn:schemas-microsoft-com:vml" xmlns:wp14="http://schemas.microsoft.com/office/word/2010/wordprocessingDrawing" xmlns:wp="http://schemas.openxmlformats.org/drawingml/2006/wordprocessingDrawing" xmlns:w10="urn:schemas-microsoft-com:office:word" xmlns:w="http://schemas.openxmlformats.org/wordprocessingml/2006/main" xmlns:w14="http://schemas.microsoft.com/office/word/2010/wordml" xmlns:w15="http://schemas.microsoft.com/office/word/2012/wordml" xmlns:wpg="http://schemas.microsoft.com/office/word/2010/wordprocessingGroup" xmlns:wpi="http://schemas.microsoft.com/office/word/2010/wordprocessingInk" xmlns:wne="http://schemas.microsoft.com/office/word/2006/wordml" xmlns:wps="http://schemas.microsoft.com/office/word/2010/wordprocessingShape" mc:Ignorable="w14 w15 wp14">
+<w:ftr xmlns:wpc="http://schemas.microsoft.com/office/word/2010/wordprocessingCanvas" xmlns:cx="http://schemas.microsoft.com/office/drawing/2014/chartex" xmlns:cx1="http://schemas.microsoft.com/office/drawing/2015/9/8/chartex" xmlns:cx2="http://schemas.microsoft.com/office/drawing/2015/10/21/chartex" xmlns:cx3="http://schemas.microsoft.com/office/drawing/2016/5/9/chartex" xmlns:cx4="http://schemas.microsoft.com/office/drawing/2016/5/10/chartex" xmlns:cx5="http://schemas.microsoft.com/office/drawing/2016/5/11/chartex" xmlns:cx6="http://schemas.microsoft.com/office/drawing/2016/5/12/chartex" xmlns:cx7="http://schemas.microsoft.com/office/drawing/2016/5/13/chartex" xmlns:cx8="http://schemas.microsoft.com/office/drawing/2016/5/14/chartex" xmlns:mc="http://schemas.openxmlformats.org/markup-compatibility/2006" xmlns:aink="http://schemas.microsoft.com/office/drawing/2016/ink" xmlns:am3d="http://schemas.microsoft.com/office/drawing/2017/model3d" xmlns:o="urn:schemas-microsoft-com:office:office" xmlns:r="http://schemas.openxmlformats.org/officeDocument/2006/relationships" xmlns:m="http://schemas.openxmlformats.org/officeDocument/2006/math" xmlns:v="urn:schemas-microsoft-com:vml" xmlns:wp14="http://schemas.microsoft.com/office/word/2010/wordprocessingDrawing" xmlns:wp="http://schemas.openxmlformats.org/drawingml/2006/wordprocessingDrawing" xmlns:w10="urn:schemas-microsoft-com:office:word" xmlns:w="http://schemas.openxmlformats.org/wordprocessingml/2006/main" xmlns:w14="http://schemas.microsoft.com/office/word/2010/wordml" xmlns:w15="http://schemas.microsoft.com/office/word/2012/wordml" xmlns:w16cex="http://schemas.microsoft.com/office/word/2018/wordml/cex" xmlns:w16cid="http://schemas.microsoft.com/office/word/2016/wordml/cid" xmlns:w16="http://schemas.microsoft.com/office/word/2018/wordml" xmlns:w16sdtdh="http://schemas.microsoft.com/office/word/2020/wordml/sdtdatahash" xmlns:w16se="http://schemas.microsoft.com/office/word/2015/wordml/symex" xmlns:wpg="http://schemas.microsoft.com/office/word/2010/wordprocessingGroup" xmlns:wpi="http://schemas.microsoft.com/office/word/2010/wordprocessingInk" xmlns:wne="http://schemas.microsoft.com/office/word/2006/wordml" xmlns:wps="http://schemas.microsoft.com/office/word/2010/wordprocessingShape" mc:Ignorable="w14 w15 w16se w16cid w16 w16cex w16sdtdh wp14">
   <w:p>
     <w:pPr>
       <w:pStyle w:val="Footer"/>
@@ -7252,7 +7173,7 @@
       <w:rPr>
         <w:color w:val="4F6228" w:themeColor="accent3" w:themeShade="80"/>
       </w:rPr>
-      <w:pict>
+      <w:pict w14:anchorId="5EC64EA8">
         <v:rect id="_x0000_i1064" style="width:468pt;height:2pt" o:hralign="center" o:hrstd="t" o:hrnoshade="t" o:hr="t" fillcolor="#c2d69b [1942]" stroked="f"/>
       </w:pict>
     </w:r>
@@ -7261,7 +7182,7 @@
 </file>
 
 <file path=word/footer3.xml><?xml version="1.0" encoding="utf-8"?>
-<w:ftr xmlns:wpc="http://schemas.microsoft.com/office/word/2010/wordprocessingCanvas" xmlns:mc="http://schemas.openxmlformats.org/markup-compatibility/2006" xmlns:o="urn:schemas-microsoft-com:office:office" xmlns:r="http://schemas.openxmlformats.org/officeDocument/2006/relationships" xmlns:m="http://schemas.openxmlformats.org/officeDocument/2006/math" xmlns:v="urn:schemas-microsoft-com:vml" xmlns:wp14="http://schemas.microsoft.com/office/word/2010/wordprocessingDrawing" xmlns:wp="http://schemas.openxmlformats.org/drawingml/2006/wordprocessingDrawing" xmlns:w10="urn:schemas-microsoft-com:office:word" xmlns:w="http://schemas.openxmlformats.org/wordprocessingml/2006/main" xmlns:w14="http://schemas.microsoft.com/office/word/2010/wordml" xmlns:w15="http://schemas.microsoft.com/office/word/2012/wordml" xmlns:wpg="http://schemas.microsoft.com/office/word/2010/wordprocessingGroup" xmlns:wpi="http://schemas.microsoft.com/office/word/2010/wordprocessingInk" xmlns:wne="http://schemas.microsoft.com/office/word/2006/wordml" xmlns:wps="http://schemas.microsoft.com/office/word/2010/wordprocessingShape" mc:Ignorable="w14 w15 wp14">
+<w:ftr xmlns:wpc="http://schemas.microsoft.com/office/word/2010/wordprocessingCanvas" xmlns:cx="http://schemas.microsoft.com/office/drawing/2014/chartex" xmlns:cx1="http://schemas.microsoft.com/office/drawing/2015/9/8/chartex" xmlns:cx2="http://schemas.microsoft.com/office/drawing/2015/10/21/chartex" xmlns:cx3="http://schemas.microsoft.com/office/drawing/2016/5/9/chartex" xmlns:cx4="http://schemas.microsoft.com/office/drawing/2016/5/10/chartex" xmlns:cx5="http://schemas.microsoft.com/office/drawing/2016/5/11/chartex" xmlns:cx6="http://schemas.microsoft.com/office/drawing/2016/5/12/chartex" xmlns:cx7="http://schemas.microsoft.com/office/drawing/2016/5/13/chartex" xmlns:cx8="http://schemas.microsoft.com/office/drawing/2016/5/14/chartex" xmlns:mc="http://schemas.openxmlformats.org/markup-compatibility/2006" xmlns:aink="http://schemas.microsoft.com/office/drawing/2016/ink" xmlns:am3d="http://schemas.microsoft.com/office/drawing/2017/model3d" xmlns:o="urn:schemas-microsoft-com:office:office" xmlns:r="http://schemas.openxmlformats.org/officeDocument/2006/relationships" xmlns:m="http://schemas.openxmlformats.org/officeDocument/2006/math" xmlns:v="urn:schemas-microsoft-com:vml" xmlns:wp14="http://schemas.microsoft.com/office/word/2010/wordprocessingDrawing" xmlns:wp="http://schemas.openxmlformats.org/drawingml/2006/wordprocessingDrawing" xmlns:w10="urn:schemas-microsoft-com:office:word" xmlns:w="http://schemas.openxmlformats.org/wordprocessingml/2006/main" xmlns:w14="http://schemas.microsoft.com/office/word/2010/wordml" xmlns:w15="http://schemas.microsoft.com/office/word/2012/wordml" xmlns:w16cex="http://schemas.microsoft.com/office/word/2018/wordml/cex" xmlns:w16cid="http://schemas.microsoft.com/office/word/2016/wordml/cid" xmlns:w16="http://schemas.microsoft.com/office/word/2018/wordml" xmlns:w16sdtdh="http://schemas.microsoft.com/office/word/2020/wordml/sdtdatahash" xmlns:w16se="http://schemas.microsoft.com/office/word/2015/wordml/symex" xmlns:wpg="http://schemas.microsoft.com/office/word/2010/wordprocessingGroup" xmlns:wpi="http://schemas.microsoft.com/office/word/2010/wordprocessingInk" xmlns:wne="http://schemas.microsoft.com/office/word/2006/wordml" xmlns:wps="http://schemas.microsoft.com/office/word/2010/wordprocessingShape" mc:Ignorable="w14 w15 w16se w16cid w16 w16cex w16sdtdh wp14">
   <w:p>
     <w:pPr>
       <w:pStyle w:val="Footer"/>
@@ -7271,7 +7192,7 @@
 </file>
 
 <file path=word/footnotes.xml><?xml version="1.0" encoding="utf-8"?>
-<w:footnotes xmlns:wpc="http://schemas.microsoft.com/office/word/2010/wordprocessingCanvas" xmlns:mc="http://schemas.openxmlformats.org/markup-compatibility/2006" xmlns:o="urn:schemas-microsoft-com:office:office" xmlns:r="http://schemas.openxmlformats.org/officeDocument/2006/relationships" xmlns:m="http://schemas.openxmlformats.org/officeDocument/2006/math" xmlns:v="urn:schemas-microsoft-com:vml" xmlns:wp14="http://schemas.microsoft.com/office/word/2010/wordprocessingDrawing" xmlns:wp="http://schemas.openxmlformats.org/drawingml/2006/wordprocessingDrawing" xmlns:w10="urn:schemas-microsoft-com:office:word" xmlns:w="http://schemas.openxmlformats.org/wordprocessingml/2006/main" xmlns:w14="http://schemas.microsoft.com/office/word/2010/wordml" xmlns:w15="http://schemas.microsoft.com/office/word/2012/wordml" xmlns:wpg="http://schemas.microsoft.com/office/word/2010/wordprocessingGroup" xmlns:wpi="http://schemas.microsoft.com/office/word/2010/wordprocessingInk" xmlns:wne="http://schemas.microsoft.com/office/word/2006/wordml" xmlns:wps="http://schemas.microsoft.com/office/word/2010/wordprocessingShape" mc:Ignorable="w14 w15 wp14">
+<w:footnotes xmlns:wpc="http://schemas.microsoft.com/office/word/2010/wordprocessingCanvas" xmlns:cx="http://schemas.microsoft.com/office/drawing/2014/chartex" xmlns:cx1="http://schemas.microsoft.com/office/drawing/2015/9/8/chartex" xmlns:cx2="http://schemas.microsoft.com/office/drawing/2015/10/21/chartex" xmlns:cx3="http://schemas.microsoft.com/office/drawing/2016/5/9/chartex" xmlns:cx4="http://schemas.microsoft.com/office/drawing/2016/5/10/chartex" xmlns:cx5="http://schemas.microsoft.com/office/drawing/2016/5/11/chartex" xmlns:cx6="http://schemas.microsoft.com/office/drawing/2016/5/12/chartex" xmlns:cx7="http://schemas.microsoft.com/office/drawing/2016/5/13/chartex" xmlns:cx8="http://schemas.microsoft.com/office/drawing/2016/5/14/chartex" xmlns:mc="http://schemas.openxmlformats.org/markup-compatibility/2006" xmlns:aink="http://schemas.microsoft.com/office/drawing/2016/ink" xmlns:am3d="http://schemas.microsoft.com/office/drawing/2017/model3d" xmlns:o="urn:schemas-microsoft-com:office:office" xmlns:r="http://schemas.openxmlformats.org/officeDocument/2006/relationships" xmlns:m="http://schemas.openxmlformats.org/officeDocument/2006/math" xmlns:v="urn:schemas-microsoft-com:vml" xmlns:wp14="http://schemas.microsoft.com/office/word/2010/wordprocessingDrawing" xmlns:wp="http://schemas.openxmlformats.org/drawingml/2006/wordprocessingDrawing" xmlns:w10="urn:schemas-microsoft-com:office:word" xmlns:w="http://schemas.openxmlformats.org/wordprocessingml/2006/main" xmlns:w14="http://schemas.microsoft.com/office/word/2010/wordml" xmlns:w15="http://schemas.microsoft.com/office/word/2012/wordml" xmlns:w16cex="http://schemas.microsoft.com/office/word/2018/wordml/cex" xmlns:w16cid="http://schemas.microsoft.com/office/word/2016/wordml/cid" xmlns:w16="http://schemas.microsoft.com/office/word/2018/wordml" xmlns:w16sdtdh="http://schemas.microsoft.com/office/word/2020/wordml/sdtdatahash" xmlns:w16se="http://schemas.microsoft.com/office/word/2015/wordml/symex" xmlns:wpg="http://schemas.microsoft.com/office/word/2010/wordprocessingGroup" xmlns:wpi="http://schemas.microsoft.com/office/word/2010/wordprocessingInk" xmlns:wne="http://schemas.microsoft.com/office/word/2006/wordml" xmlns:wps="http://schemas.microsoft.com/office/word/2010/wordprocessingShape" mc:Ignorable="w14 w15 w16se w16cid w16 w16cex w16sdtdh wp14">
   <w:footnote w:type="separator" w:id="-1">
     <w:p>
       <w:r>
@@ -7290,7 +7211,7 @@
 </file>
 
 <file path=word/header1.xml><?xml version="1.0" encoding="utf-8"?>
-<w:hdr xmlns:wpc="http://schemas.microsoft.com/office/word/2010/wordprocessingCanvas" xmlns:mc="http://schemas.openxmlformats.org/markup-compatibility/2006" xmlns:o="urn:schemas-microsoft-com:office:office" xmlns:r="http://schemas.openxmlformats.org/officeDocument/2006/relationships" xmlns:m="http://schemas.openxmlformats.org/officeDocument/2006/math" xmlns:v="urn:schemas-microsoft-com:vml" xmlns:wp14="http://schemas.microsoft.com/office/word/2010/wordprocessingDrawing" xmlns:wp="http://schemas.openxmlformats.org/drawingml/2006/wordprocessingDrawing" xmlns:w10="urn:schemas-microsoft-com:office:word" xmlns:w="http://schemas.openxmlformats.org/wordprocessingml/2006/main" xmlns:w14="http://schemas.microsoft.com/office/word/2010/wordml" xmlns:w15="http://schemas.microsoft.com/office/word/2012/wordml" xmlns:wpg="http://schemas.microsoft.com/office/word/2010/wordprocessingGroup" xmlns:wpi="http://schemas.microsoft.com/office/word/2010/wordprocessingInk" xmlns:wne="http://schemas.microsoft.com/office/word/2006/wordml" xmlns:wps="http://schemas.microsoft.com/office/word/2010/wordprocessingShape" mc:Ignorable="w14 w15 wp14">
+<w:hdr xmlns:wpc="http://schemas.microsoft.com/office/word/2010/wordprocessingCanvas" xmlns:cx="http://schemas.microsoft.com/office/drawing/2014/chartex" xmlns:cx1="http://schemas.microsoft.com/office/drawing/2015/9/8/chartex" xmlns:cx2="http://schemas.microsoft.com/office/drawing/2015/10/21/chartex" xmlns:cx3="http://schemas.microsoft.com/office/drawing/2016/5/9/chartex" xmlns:cx4="http://schemas.microsoft.com/office/drawing/2016/5/10/chartex" xmlns:cx5="http://schemas.microsoft.com/office/drawing/2016/5/11/chartex" xmlns:cx6="http://schemas.microsoft.com/office/drawing/2016/5/12/chartex" xmlns:cx7="http://schemas.microsoft.com/office/drawing/2016/5/13/chartex" xmlns:cx8="http://schemas.microsoft.com/office/drawing/2016/5/14/chartex" xmlns:mc="http://schemas.openxmlformats.org/markup-compatibility/2006" xmlns:aink="http://schemas.microsoft.com/office/drawing/2016/ink" xmlns:am3d="http://schemas.microsoft.com/office/drawing/2017/model3d" xmlns:o="urn:schemas-microsoft-com:office:office" xmlns:r="http://schemas.openxmlformats.org/officeDocument/2006/relationships" xmlns:m="http://schemas.openxmlformats.org/officeDocument/2006/math" xmlns:v="urn:schemas-microsoft-com:vml" xmlns:wp14="http://schemas.microsoft.com/office/word/2010/wordprocessingDrawing" xmlns:wp="http://schemas.openxmlformats.org/drawingml/2006/wordprocessingDrawing" xmlns:w10="urn:schemas-microsoft-com:office:word" xmlns:w="http://schemas.openxmlformats.org/wordprocessingml/2006/main" xmlns:w14="http://schemas.microsoft.com/office/word/2010/wordml" xmlns:w15="http://schemas.microsoft.com/office/word/2012/wordml" xmlns:w16cex="http://schemas.microsoft.com/office/word/2018/wordml/cex" xmlns:w16cid="http://schemas.microsoft.com/office/word/2016/wordml/cid" xmlns:w16="http://schemas.microsoft.com/office/word/2018/wordml" xmlns:w16sdtdh="http://schemas.microsoft.com/office/word/2020/wordml/sdtdatahash" xmlns:w16se="http://schemas.microsoft.com/office/word/2015/wordml/symex" xmlns:wpg="http://schemas.microsoft.com/office/word/2010/wordprocessingGroup" xmlns:wpi="http://schemas.microsoft.com/office/word/2010/wordprocessingInk" xmlns:wne="http://schemas.microsoft.com/office/word/2006/wordml" xmlns:wps="http://schemas.microsoft.com/office/word/2010/wordprocessingShape" mc:Ignorable="w14 w15 w16se w16cid w16 w16cex w16sdtdh wp14">
   <w:p>
     <w:pPr>
       <w:pStyle w:val="Header"/>
@@ -7300,7 +7221,7 @@
 </file>
 
 <file path=word/header2.xml><?xml version="1.0" encoding="utf-8"?>
-<w:hdr xmlns:wpc="http://schemas.microsoft.com/office/word/2010/wordprocessingCanvas" xmlns:mc="http://schemas.openxmlformats.org/markup-compatibility/2006" xmlns:o="urn:schemas-microsoft-com:office:office" xmlns:r="http://schemas.openxmlformats.org/officeDocument/2006/relationships" xmlns:m="http://schemas.openxmlformats.org/officeDocument/2006/math" xmlns:v="urn:schemas-microsoft-com:vml" xmlns:wp14="http://schemas.microsoft.com/office/word/2010/wordprocessingDrawing" xmlns:wp="http://schemas.openxmlformats.org/drawingml/2006/wordprocessingDrawing" xmlns:w10="urn:schemas-microsoft-com:office:word" xmlns:w="http://schemas.openxmlformats.org/wordprocessingml/2006/main" xmlns:w14="http://schemas.microsoft.com/office/word/2010/wordml" xmlns:w15="http://schemas.microsoft.com/office/word/2012/wordml" xmlns:wpg="http://schemas.microsoft.com/office/word/2010/wordprocessingGroup" xmlns:wpi="http://schemas.microsoft.com/office/word/2010/wordprocessingInk" xmlns:wne="http://schemas.microsoft.com/office/word/2006/wordml" xmlns:wps="http://schemas.microsoft.com/office/word/2010/wordprocessingShape" mc:Ignorable="w14 w15 wp14">
+<w:hdr xmlns:wpc="http://schemas.microsoft.com/office/word/2010/wordprocessingCanvas" xmlns:cx="http://schemas.microsoft.com/office/drawing/2014/chartex" xmlns:cx1="http://schemas.microsoft.com/office/drawing/2015/9/8/chartex" xmlns:cx2="http://schemas.microsoft.com/office/drawing/2015/10/21/chartex" xmlns:cx3="http://schemas.microsoft.com/office/drawing/2016/5/9/chartex" xmlns:cx4="http://schemas.microsoft.com/office/drawing/2016/5/10/chartex" xmlns:cx5="http://schemas.microsoft.com/office/drawing/2016/5/11/chartex" xmlns:cx6="http://schemas.microsoft.com/office/drawing/2016/5/12/chartex" xmlns:cx7="http://schemas.microsoft.com/office/drawing/2016/5/13/chartex" xmlns:cx8="http://schemas.microsoft.com/office/drawing/2016/5/14/chartex" xmlns:mc="http://schemas.openxmlformats.org/markup-compatibility/2006" xmlns:aink="http://schemas.microsoft.com/office/drawing/2016/ink" xmlns:am3d="http://schemas.microsoft.com/office/drawing/2017/model3d" xmlns:o="urn:schemas-microsoft-com:office:office" xmlns:r="http://schemas.openxmlformats.org/officeDocument/2006/relationships" xmlns:m="http://schemas.openxmlformats.org/officeDocument/2006/math" xmlns:v="urn:schemas-microsoft-com:vml" xmlns:wp14="http://schemas.microsoft.com/office/word/2010/wordprocessingDrawing" xmlns:wp="http://schemas.openxmlformats.org/drawingml/2006/wordprocessingDrawing" xmlns:w10="urn:schemas-microsoft-com:office:word" xmlns:w="http://schemas.openxmlformats.org/wordprocessingml/2006/main" xmlns:w14="http://schemas.microsoft.com/office/word/2010/wordml" xmlns:w15="http://schemas.microsoft.com/office/word/2012/wordml" xmlns:w16cex="http://schemas.microsoft.com/office/word/2018/wordml/cex" xmlns:w16cid="http://schemas.microsoft.com/office/word/2016/wordml/cid" xmlns:w16="http://schemas.microsoft.com/office/word/2018/wordml" xmlns:w16sdtdh="http://schemas.microsoft.com/office/word/2020/wordml/sdtdatahash" xmlns:w16se="http://schemas.microsoft.com/office/word/2015/wordml/symex" xmlns:wpg="http://schemas.microsoft.com/office/word/2010/wordprocessingGroup" xmlns:wpi="http://schemas.microsoft.com/office/word/2010/wordprocessingInk" xmlns:wne="http://schemas.microsoft.com/office/word/2006/wordml" xmlns:wps="http://schemas.microsoft.com/office/word/2010/wordprocessingShape" mc:Ignorable="w14 w15 w16se w16cid w16 w16cex w16sdtdh wp14">
   <w:p>
     <w:pPr>
       <w:pStyle w:val="Header"/>
@@ -7311,7 +7232,7 @@
         <w:noProof/>
       </w:rPr>
       <w:drawing>
-        <wp:anchor distT="0" distB="0" distL="114300" distR="114300" simplePos="0" relativeHeight="251658240" behindDoc="0" locked="0" layoutInCell="1" allowOverlap="1">
+        <wp:anchor distT="0" distB="0" distL="114300" distR="114300" simplePos="0" relativeHeight="251658240" behindDoc="0" locked="0" layoutInCell="1" allowOverlap="1" wp14:anchorId="72D598A7" wp14:editId="074E37FB">
           <wp:simplePos x="0" y="0"/>
           <wp:positionH relativeFrom="column">
             <wp:posOffset>-786130</wp:posOffset>
@@ -7368,7 +7289,7 @@
 </file>
 
 <file path=word/header3.xml><?xml version="1.0" encoding="utf-8"?>
-<w:hdr xmlns:wpc="http://schemas.microsoft.com/office/word/2010/wordprocessingCanvas" xmlns:mc="http://schemas.openxmlformats.org/markup-compatibility/2006" xmlns:o="urn:schemas-microsoft-com:office:office" xmlns:r="http://schemas.openxmlformats.org/officeDocument/2006/relationships" xmlns:m="http://schemas.openxmlformats.org/officeDocument/2006/math" xmlns:v="urn:schemas-microsoft-com:vml" xmlns:wp14="http://schemas.microsoft.com/office/word/2010/wordprocessingDrawing" xmlns:wp="http://schemas.openxmlformats.org/drawingml/2006/wordprocessingDrawing" xmlns:w10="urn:schemas-microsoft-com:office:word" xmlns:w="http://schemas.openxmlformats.org/wordprocessingml/2006/main" xmlns:w14="http://schemas.microsoft.com/office/word/2010/wordml" xmlns:w15="http://schemas.microsoft.com/office/word/2012/wordml" xmlns:wpg="http://schemas.microsoft.com/office/word/2010/wordprocessingGroup" xmlns:wpi="http://schemas.microsoft.com/office/word/2010/wordprocessingInk" xmlns:wne="http://schemas.microsoft.com/office/word/2006/wordml" xmlns:wps="http://schemas.microsoft.com/office/word/2010/wordprocessingShape" mc:Ignorable="w14 w15 wp14">
+<w:hdr xmlns:wpc="http://schemas.microsoft.com/office/word/2010/wordprocessingCanvas" xmlns:cx="http://schemas.microsoft.com/office/drawing/2014/chartex" xmlns:cx1="http://schemas.microsoft.com/office/drawing/2015/9/8/chartex" xmlns:cx2="http://schemas.microsoft.com/office/drawing/2015/10/21/chartex" xmlns:cx3="http://schemas.microsoft.com/office/drawing/2016/5/9/chartex" xmlns:cx4="http://schemas.microsoft.com/office/drawing/2016/5/10/chartex" xmlns:cx5="http://schemas.microsoft.com/office/drawing/2016/5/11/chartex" xmlns:cx6="http://schemas.microsoft.com/office/drawing/2016/5/12/chartex" xmlns:cx7="http://schemas.microsoft.com/office/drawing/2016/5/13/chartex" xmlns:cx8="http://schemas.microsoft.com/office/drawing/2016/5/14/chartex" xmlns:mc="http://schemas.openxmlformats.org/markup-compatibility/2006" xmlns:aink="http://schemas.microsoft.com/office/drawing/2016/ink" xmlns:am3d="http://schemas.microsoft.com/office/drawing/2017/model3d" xmlns:o="urn:schemas-microsoft-com:office:office" xmlns:r="http://schemas.openxmlformats.org/officeDocument/2006/relationships" xmlns:m="http://schemas.openxmlformats.org/officeDocument/2006/math" xmlns:v="urn:schemas-microsoft-com:vml" xmlns:wp14="http://schemas.microsoft.com/office/word/2010/wordprocessingDrawing" xmlns:wp="http://schemas.openxmlformats.org/drawingml/2006/wordprocessingDrawing" xmlns:w10="urn:schemas-microsoft-com:office:word" xmlns:w="http://schemas.openxmlformats.org/wordprocessingml/2006/main" xmlns:w14="http://schemas.microsoft.com/office/word/2010/wordml" xmlns:w15="http://schemas.microsoft.com/office/word/2012/wordml" xmlns:w16cex="http://schemas.microsoft.com/office/word/2018/wordml/cex" xmlns:w16cid="http://schemas.microsoft.com/office/word/2016/wordml/cid" xmlns:w16="http://schemas.microsoft.com/office/word/2018/wordml" xmlns:w16sdtdh="http://schemas.microsoft.com/office/word/2020/wordml/sdtdatahash" xmlns:w16se="http://schemas.microsoft.com/office/word/2015/wordml/symex" xmlns:wpg="http://schemas.microsoft.com/office/word/2010/wordprocessingGroup" xmlns:wpi="http://schemas.microsoft.com/office/word/2010/wordprocessingInk" xmlns:wne="http://schemas.microsoft.com/office/word/2006/wordml" xmlns:wps="http://schemas.microsoft.com/office/word/2010/wordprocessingShape" mc:Ignorable="w14 w15 w16se w16cid w16 w16cex w16sdtdh wp14">
   <w:p>
     <w:pPr>
       <w:pStyle w:val="Header"/>
@@ -7378,7 +7299,7 @@
 </file>
 
 <file path=word/numbering.xml><?xml version="1.0" encoding="utf-8"?>
-<w:numbering xmlns:wpc="http://schemas.microsoft.com/office/word/2010/wordprocessingCanvas" xmlns:mc="http://schemas.openxmlformats.org/markup-compatibility/2006" xmlns:o="urn:schemas-microsoft-com:office:office" xmlns:r="http://schemas.openxmlformats.org/officeDocument/2006/relationships" xmlns:m="http://schemas.openxmlformats.org/officeDocument/2006/math" xmlns:v="urn:schemas-microsoft-com:vml" xmlns:wp14="http://schemas.microsoft.com/office/word/2010/wordprocessingDrawing" xmlns:wp="http://schemas.openxmlformats.org/drawingml/2006/wordprocessingDrawing" xmlns:w10="urn:schemas-microsoft-com:office:word" xmlns:w="http://schemas.openxmlformats.org/wordprocessingml/2006/main" xmlns:w14="http://schemas.microsoft.com/office/word/2010/wordml" xmlns:w15="http://schemas.microsoft.com/office/word/2012/wordml" xmlns:wpg="http://schemas.microsoft.com/office/word/2010/wordprocessingGroup" xmlns:wpi="http://schemas.microsoft.com/office/word/2010/wordprocessingInk" xmlns:wne="http://schemas.microsoft.com/office/word/2006/wordml" xmlns:wps="http://schemas.microsoft.com/office/word/2010/wordprocessingShape" mc:Ignorable="w14 w15 wp14">
+<w:numbering xmlns:wpc="http://schemas.microsoft.com/office/word/2010/wordprocessingCanvas" xmlns:cx="http://schemas.microsoft.com/office/drawing/2014/chartex" xmlns:cx1="http://schemas.microsoft.com/office/drawing/2015/9/8/chartex" xmlns:cx2="http://schemas.microsoft.com/office/drawing/2015/10/21/chartex" xmlns:cx3="http://schemas.microsoft.com/office/drawing/2016/5/9/chartex" xmlns:cx4="http://schemas.microsoft.com/office/drawing/2016/5/10/chartex" xmlns:cx5="http://schemas.microsoft.com/office/drawing/2016/5/11/chartex" xmlns:cx6="http://schemas.microsoft.com/office/drawing/2016/5/12/chartex" xmlns:cx7="http://schemas.microsoft.com/office/drawing/2016/5/13/chartex" xmlns:cx8="http://schemas.microsoft.com/office/drawing/2016/5/14/chartex" xmlns:mc="http://schemas.openxmlformats.org/markup-compatibility/2006" xmlns:aink="http://schemas.microsoft.com/office/drawing/2016/ink" xmlns:am3d="http://schemas.microsoft.com/office/drawing/2017/model3d" xmlns:o="urn:schemas-microsoft-com:office:office" xmlns:r="http://schemas.openxmlformats.org/officeDocument/2006/relationships" xmlns:m="http://schemas.openxmlformats.org/officeDocument/2006/math" xmlns:v="urn:schemas-microsoft-com:vml" xmlns:wp14="http://schemas.microsoft.com/office/word/2010/wordprocessingDrawing" xmlns:wp="http://schemas.openxmlformats.org/drawingml/2006/wordprocessingDrawing" xmlns:w10="urn:schemas-microsoft-com:office:word" xmlns:w="http://schemas.openxmlformats.org/wordprocessingml/2006/main" xmlns:w14="http://schemas.microsoft.com/office/word/2010/wordml" xmlns:w15="http://schemas.microsoft.com/office/word/2012/wordml" xmlns:w16cex="http://schemas.microsoft.com/office/word/2018/wordml/cex" xmlns:w16cid="http://schemas.microsoft.com/office/word/2016/wordml/cid" xmlns:w16="http://schemas.microsoft.com/office/word/2018/wordml" xmlns:w16sdtdh="http://schemas.microsoft.com/office/word/2020/wordml/sdtdatahash" xmlns:w16se="http://schemas.microsoft.com/office/word/2015/wordml/symex" xmlns:wpg="http://schemas.microsoft.com/office/word/2010/wordprocessingGroup" xmlns:wpi="http://schemas.microsoft.com/office/word/2010/wordprocessingInk" xmlns:wne="http://schemas.microsoft.com/office/word/2006/wordml" xmlns:wps="http://schemas.microsoft.com/office/word/2010/wordprocessingShape" mc:Ignorable="w14 w15 w16se w16cid w16 w16cex w16sdtdh wp14">
   <w:abstractNum w:abstractNumId="0" w15:restartNumberingAfterBreak="0">
     <w:nsid w:val="FFFFFF7E"/>
     <w:multiLevelType w:val="singleLevel"/>
@@ -13079,7 +13000,7 @@
 </file>
 
 <file path=word/styles.xml><?xml version="1.0" encoding="utf-8"?>
-<w:styles xmlns:mc="http://schemas.openxmlformats.org/markup-compatibility/2006" xmlns:r="http://schemas.openxmlformats.org/officeDocument/2006/relationships" xmlns:w="http://schemas.openxmlformats.org/wordprocessingml/2006/main" xmlns:w14="http://schemas.microsoft.com/office/word/2010/wordml" xmlns:w15="http://schemas.microsoft.com/office/word/2012/wordml" mc:Ignorable="w14 w15">
+<w:styles xmlns:mc="http://schemas.openxmlformats.org/markup-compatibility/2006" xmlns:r="http://schemas.openxmlformats.org/officeDocument/2006/relationships" xmlns:w="http://schemas.openxmlformats.org/wordprocessingml/2006/main" xmlns:w14="http://schemas.microsoft.com/office/word/2010/wordml" xmlns:w15="http://schemas.microsoft.com/office/word/2012/wordml" xmlns:w16cex="http://schemas.microsoft.com/office/word/2018/wordml/cex" xmlns:w16cid="http://schemas.microsoft.com/office/word/2016/wordml/cid" xmlns:w16="http://schemas.microsoft.com/office/word/2018/wordml" xmlns:w16sdtdh="http://schemas.microsoft.com/office/word/2020/wordml/sdtdatahash" xmlns:w16se="http://schemas.microsoft.com/office/word/2015/wordml/symex" mc:Ignorable="w14 w15 w16se w16cid w16 w16cex w16sdtdh">
   <w:docDefaults>
     <w:rPrDefault>
       <w:rPr>
@@ -13095,7 +13016,7 @@
       </w:pPr>
     </w:pPrDefault>
   </w:docDefaults>
-  <w:latentStyles w:defLockedState="0" w:defUIPriority="99" w:defSemiHidden="0" w:defUnhideWhenUsed="0" w:defQFormat="0" w:count="371">
+  <w:latentStyles w:defLockedState="0" w:defUIPriority="99" w:defSemiHidden="0" w:defUnhideWhenUsed="0" w:defQFormat="0" w:count="376">
     <w:lsdException w:name="Normal" w:uiPriority="0" w:qFormat="1"/>
     <w:lsdException w:name="heading 1" w:uiPriority="9" w:qFormat="1"/>
     <w:lsdException w:name="heading 2" w:semiHidden="1" w:uiPriority="9" w:unhideWhenUsed="1" w:qFormat="1"/>
@@ -13201,7 +13122,6 @@
     <w:lsdException w:name="HTML Sample" w:semiHidden="1" w:unhideWhenUsed="1"/>
     <w:lsdException w:name="HTML Typewriter" w:semiHidden="1" w:unhideWhenUsed="1"/>
     <w:lsdException w:name="HTML Variable" w:semiHidden="1" w:unhideWhenUsed="1"/>
-    <w:lsdException w:name="Normal Table" w:semiHidden="1" w:unhideWhenUsed="1"/>
     <w:lsdException w:name="annotation subject" w:semiHidden="1" w:unhideWhenUsed="1"/>
     <w:lsdException w:name="No List" w:semiHidden="1" w:unhideWhenUsed="1"/>
     <w:lsdException w:name="Outline List 1" w:semiHidden="1" w:unhideWhenUsed="1"/>
@@ -13244,11 +13164,8 @@
     <w:lsdException w:name="Table Contemporary" w:semiHidden="1" w:unhideWhenUsed="1"/>
     <w:lsdException w:name="Table Elegant" w:semiHidden="1" w:unhideWhenUsed="1"/>
     <w:lsdException w:name="Table Professional" w:semiHidden="1" w:unhideWhenUsed="1"/>
-    <w:lsdException w:name="Table Subtle 1" w:semiHidden="1" w:unhideWhenUsed="1"/>
     <w:lsdException w:name="Table Subtle 2" w:semiHidden="1" w:unhideWhenUsed="1"/>
     <w:lsdException w:name="Table Web 1" w:semiHidden="1" w:unhideWhenUsed="1"/>
-    <w:lsdException w:name="Table Web 2" w:semiHidden="1" w:unhideWhenUsed="1"/>
-    <w:lsdException w:name="Table Web 3" w:semiHidden="1" w:unhideWhenUsed="1"/>
     <w:lsdException w:name="Balloon Text" w:semiHidden="1" w:unhideWhenUsed="1"/>
     <w:lsdException w:name="Table Grid" w:uiPriority="59"/>
     <w:lsdException w:name="Table Theme" w:semiHidden="1" w:unhideWhenUsed="1"/>
@@ -13458,6 +13375,11 @@
     <w:lsdException w:name="List Table 5 Dark Accent 6" w:uiPriority="50"/>
     <w:lsdException w:name="List Table 6 Colorful Accent 6" w:uiPriority="51"/>
     <w:lsdException w:name="List Table 7 Colorful Accent 6" w:uiPriority="52"/>
+    <w:lsdException w:name="Mention" w:semiHidden="1" w:unhideWhenUsed="1"/>
+    <w:lsdException w:name="Smart Hyperlink" w:semiHidden="1" w:unhideWhenUsed="1"/>
+    <w:lsdException w:name="Hashtag" w:semiHidden="1" w:unhideWhenUsed="1"/>
+    <w:lsdException w:name="Unresolved Mention" w:semiHidden="1" w:unhideWhenUsed="1"/>
+    <w:lsdException w:name="Smart Link" w:semiHidden="1" w:unhideWhenUsed="1"/>
   </w:latentStyles>
   <w:style w:type="paragraph" w:default="1" w:styleId="Normal">
     <w:name w:val="Normal"/>

</xml_diff>